<commit_message>
chore(order): rebuild DRAFT memo template.docx files from hand-authored bodyHtml
The pipeline-generated template.docx for the four DRAFT memo docs
(notify_discipline, submit_inquiry, ruling_report, timebar_secgen) carried
almost no {field} placeholders because the gap/white extraction couldn't
anchor them. Regenerate each template.docx directly from its hand-authored
bodyHtml so the Word download for docxtemplater has every {field} token
(20/16/19/23) and matches the web preview structure. TH Sarabun New 16pt,
centered titles/signatures, DRAFT banner retained.

npm test 5/5.

Co-Authored-By: Claude Sonnet 5 <noreply@anthropic.com>
Claude-Session: https://claude.ai/code/session_01TtyaT7LUjewPbScm9UwY1y
</commit_message>
<xml_diff>
--- a/assets/templates/memo-7x-notify-discipline.docx
+++ b/assets/templates/memo-7x-notify-discipline.docx
@@ -3,655 +3,118 @@
 <w:document xmlns:wpc="http://schemas.microsoft.com/office/word/2010/wordprocessingCanvas" xmlns:mo="http://schemas.microsoft.com/office/mac/office/2008/main" xmlns:mc="http://schemas.openxmlformats.org/markup-compatibility/2006" xmlns:mv="urn:schemas-microsoft-com:mac:vml" xmlns:o="urn:schemas-microsoft-com:office:office" xmlns:r="http://schemas.openxmlformats.org/officeDocument/2006/relationships" xmlns:m="http://schemas.openxmlformats.org/officeDocument/2006/math" xmlns:v="urn:schemas-microsoft-com:vml" xmlns:wp14="http://schemas.microsoft.com/office/word/2010/wordprocessingDrawing" xmlns:wp="http://schemas.openxmlformats.org/drawingml/2006/wordprocessingDrawing" xmlns:w10="urn:schemas-microsoft-com:office:word" xmlns:w="http://schemas.openxmlformats.org/wordprocessingml/2006/main" xmlns:w14="http://schemas.microsoft.com/office/word/2010/wordml" xmlns:wpg="http://schemas.microsoft.com/office/word/2010/wordprocessingGroup" xmlns:wpi="http://schemas.microsoft.com/office/word/2010/wordprocessingInk" xmlns:wne="http://schemas.microsoft.com/office/word/2006/wordml" xmlns:wps="http://schemas.microsoft.com/office/word/2010/wordprocessingShape" mc:Ignorable="w14 wp14">
   <w:body>
     <w:p>
-      <w:pPr>
-        <w:jc w:val="center"/>
-      </w:pPr>
       <w:r>
-        <w:t>สำเนาคู่ฉบับ</w:t>
+        <w:t>ร่าง — แม่แบบนี้ยังไม่ผ่านการตรวจถ้อยคำโดยฝ่ายเลขานุการ กก.ป.ป.ท. ห้ามใช้อ้างอิงทางราชการ</w:t>
       </w:r>
     </w:p>
     <w:p>
-      <w:pPr>
-        <w:jc w:val="left"/>
-      </w:pPr>
-    </w:p>
-    <w:p>
-      <w:pPr>
-        <w:jc w:val="left"/>
-      </w:pPr>
-    </w:p>
-    <w:p>
-      <w:pPr>
-        <w:jc w:val="left"/>
-      </w:pPr>
-    </w:p>
-    <w:p>
-      <w:pPr>
-        <w:jc w:val="left"/>
-      </w:pPr>
-    </w:p>
-    <w:p>
-      <w:pPr>
-        <w:jc w:val="left"/>
-      </w:pPr>
       <w:r>
-        <w:t>ที่ ปป 0004/ป</w:t>
+        <w:t>ที่  ปป 0004/ป {doc_ref_no}</w:t>
       </w:r>
     </w:p>
     <w:p>
-      <w:pPr>
-        <w:jc w:val="left"/>
-      </w:pPr>
       <w:r>
-        <w:t>สำนักงาน ป.ป.ท.</w:t>
+        <w:t>สำนักงาน ป.ป.ท.  อาคารซอฟต์แวร์ปาร์ค ถนนแจ้งวัฒนะ  อำเภอปากเกร็ด จังหวัดนนทบุรี ๑๑๑๒๐</w:t>
       </w:r>
     </w:p>
     <w:p>
-      <w:pPr>
-        <w:jc w:val="left"/>
-      </w:pPr>
-    </w:p>
-    <w:p>
-      <w:pPr>
-        <w:jc w:val="left"/>
-      </w:pPr>
       <w:r>
-        <w:t>อาคารซอฟแวร์ปาร์ค ถนนแจ้งวัฒนะ</w:t>
+        <w:t>วันที่ {doc_date}</w:t>
       </w:r>
     </w:p>
     <w:p>
-      <w:pPr>
-        <w:jc w:val="left"/>
-      </w:pPr>
-    </w:p>
-    <w:p>
-      <w:pPr>
-        <w:jc w:val="right"/>
-      </w:pPr>
-      <w:r>
-        <w:t>อำเภอปากเกร็ด จังหวัดนนทบุรี ๑๑๑๒๐</w:t>
-      </w:r>
-    </w:p>
-    <w:p>
-      <w:pPr>
-        <w:jc w:val="left"/>
-      </w:pPr>
-    </w:p>
-    <w:p>
-      <w:pPr>
-        <w:jc w:val="left"/>
-      </w:pPr>
-      <w:r>
-        <w:t>สิงหาคม  2569</w:t>
-      </w:r>
-    </w:p>
-    <w:p>
-      <w:pPr>
-        <w:jc w:val="left"/>
-      </w:pPr>
       <w:r>
         <w:t>เรื่อง   ขอให้พิจารณาลงโทษทางวินัย</w:t>
       </w:r>
     </w:p>
     <w:p>
-      <w:pPr>
-        <w:jc w:val="left"/>
-      </w:pPr>
       <w:r>
-        <w:t>เรียน  อธิการบดีมหาวิทยาลัยนเรศวร</w:t>
+        <w:t>เรียน   {recipient_title}</w:t>
       </w:r>
     </w:p>
     <w:p>
-      <w:pPr>
-        <w:jc w:val="left"/>
-      </w:pPr>
       <w:r>
-        <w:t>สิ่งที่ส่งมาด้วย   1. สำเนารายงานการไต่สวนเพื่อวินิจฉัยชี้มูลของคณะกรรมการ ป.ป.ท. เรื่องที่ 111674/2560</w:t>
+        <w:t>สิ่งที่ส่งมาด้วย   ๑. สำเนารายงานการไต่สวนเพื่อวินิจฉัยชี้มูลของคณะกรรมการ ป.ป.ท. เรื่องที่ {case_no}</w:t>
       </w:r>
     </w:p>
     <w:p>
-      <w:pPr>
-        <w:jc w:val="left"/>
-      </w:pPr>
       <w:r>
-        <w:t>จำนวน 27 แผ่น</w:t>
+        <w:t>๒. สำเนามติคณะกรรมการ ป.ป.ท. ครั้งที่ {meeting_no} เมื่อวันที่ {meeting_date}</w:t>
+      </w:r>
+    </w:p>
+    <w:p/>
+    <w:p>
+      <w:r>
+        <w:t>ด้วยคณะกรรมการป้องกันและปราบปรามการทุจริตในภาครัฐ (คณะกรรมการ ป.ป.ท.) ได้ดำเนินการไต่สวน โดยแต่งตั้งคณะพนักงานไต่สวน กรณีกล่าวหา {accused_1_name} ขณะเกิดเหตุเป็น{accused_1_affiliation} สังกัด{agency_name} ผู้ถูกกล่าวหาที่ ๑ ว่ากระทำความผิดฐานทุจริตต่อหน้าที่ (ผู้ถูกกล่าวหารายอื่นในสำนวนเดียวกัน ถ้ามี ได้แก่ {accused_2_name} ผู้ถูกกล่าวหาที่ ๒ และ {accused_3_name} ผู้ถูกกล่าวหาที่ ๓)</w:t>
+      </w:r>
+    </w:p>
+    <w:p/>
+    <w:p>
+      <w:r>
+        <w:t>คณะกรรมการ ป.ป.ท. ได้พิจารณาสำนวนการไต่สวน ในคราวประชุมครั้งที่ {meeting_no} เมื่อวันที่ {meeting_date} ระเบียบวาระที่ {agenda_item} แล้วมีมติเป็นเอกฉันท์วินิจฉัยชี้มูลความผิด ดังนี้</w:t>
+      </w:r>
+    </w:p>
+    <w:p/>
+    <w:p>
+      <w:r>
+        <w:t>ความผิดทางอาญา</w:t>
       </w:r>
     </w:p>
     <w:p>
-      <w:pPr>
-        <w:jc w:val="left"/>
-      </w:pPr>
+      <w:r>
+        <w:t>{offense_summary}</w:t>
+      </w:r>
     </w:p>
+    <w:p>
+      <w:r>
+        <w:t>การกระทำของผู้ถูกกล่าวหาตามข้อกล่าวหาข้างต้น เป็นความผิดตามประมวลกฎหมายอาญา {criminal_code_section} และพระราชบัญญัติประกอบรัฐธรรมนูญว่าด้วยการป้องกันและปราบปรามการทุจริต พ.ศ. ๒๕๔๒ และที่แก้ไขเพิ่มเติม มาตรา ๑๒๓/๑ ซึ่งเป็นกฎหมายที่ใช้บังคับขณะกระทำความผิด (ปัจจุบันเป็นความผิดตามพระราชบัญญัติประกอบรัฐธรรมนูญว่าด้วยการป้องกันและปราบปรามการทุจริต พ.ศ. ๒๕๖๑ มาตรา ๑๗๒) ประกอบประมวลกฎหมายอาญา มาตรา ๙๑</w:t>
+      </w:r>
+    </w:p>
+    <w:p/>
+    <w:p>
+      <w:r>
+        <w:t>ความผิดทางวินัย</w:t>
+      </w:r>
+    </w:p>
+    <w:p>
+      <w:r>
+        <w:t>การกระทำของ {accused_1_name} ผู้ถูกกล่าวหาที่ ๑ เป็นความผิดวินัยอย่างร้ายแรง ฐานปฏิบัติหรือละเว้นการปฏิบัติหน้าที่ราชการโดยมิชอบ เพื่อให้ตนเองหรือผู้อื่นได้รับประโยชน์ที่มิควรได้ อันเป็นการทุจริตต่อหน้าที่ราชการ ตาม{univ_regulation} ประกอบพระราชบัญญัติระเบียบข้าราชการพลเรือนในสถาบันอุดมศึกษา พ.ศ. ๒๕๔๗ และที่แก้ไขเพิ่มเติม มาตรา ๓๙ วรรคสาม ถือเป็นการกระทำการทุจริตในภาครัฐ ตามนัยมาตรา ๓ แห่งพระราชบัญญัติมาตรการของฝ่ายบริหารในการป้องกันและปราบปรามการทุจริต พ.ศ. ๒๕๕๑ และที่แก้ไขเพิ่มเติม</w:t>
+      </w:r>
+    </w:p>
+    <w:p/>
+    <w:p>
+      <w:r>
+        <w:t>ดังนั้น เพื่อปฏิบัติตามมาตรา ๓๘ และมาตรา ๔๑ แห่งพระราชบัญญัติมาตรการของฝ่ายบริหารในการป้องกันและปราบปรามการทุจริต พ.ศ. ๒๕๕๑ และที่แก้ไขเพิ่มเติม จึงขอส่งรายงานการไต่สวนเพื่อวินิจฉัยชี้มูลของคณะกรรมการ ป.ป.ท. และเอกสารที่เกี่ยวข้องมายังท่าน เพื่อพิจารณาโทษทางวินัยแก่ {accused_1_name} ผู้ถูกกล่าวหาที่ ๑ ในฐานความผิดดังกล่าวตามกฎหมาย ระเบียบ หรือข้อบังคับว่าด้วยการบริหารงานบุคคลที่ใช้บังคับกับผู้ถูกกล่าวหา ภายใน ๖๐ วัน นับแต่วันที่ได้รับแจ้งมติคณะกรรมการ ป.ป.ท. โดยมิต้องดำเนินการสอบสวนทางวินัยอีก และเมื่อได้ดำเนินการลงโทษทางวินัยแล้ว ขอได้ส่งสำเนาคำสั่งลงโทษดังกล่าวให้คณะกรรมการ ป.ป.ท. ทราบ ภายใน ๓๐ วัน นับแต่วันที่ได้ออกคำสั่งด้วย</w:t>
+      </w:r>
+    </w:p>
+    <w:p>
+      <w:r>
+        <w:t>อนึ่ง สำหรับความผิดทางอาญาในเรื่องนี้ ได้ส่งเรื่องให้พนักงานอัยการเพื่อดำเนินคดีอาญาแก่บุคคลดังกล่าวแล้ว</w:t>
+      </w:r>
+    </w:p>
+    <w:p>
+      <w:r>
+        <w:t>จึงเรียนมาเพื่อโปรดพิจารณาดำเนินการในส่วนที่เกี่ยวข้องต่อไป</w:t>
+      </w:r>
+    </w:p>
+    <w:p/>
     <w:p>
       <w:pPr>
         <w:jc w:val="center"/>
       </w:pPr>
       <w:r>
-        <w:t>2. สำเนามติคณะกรรมการ ป.ป.ท. ครั้งที่ 61/2569 เมื่อวันที่ 19 สิงหาคม 2569</w:t>
+        <w:t>ขอแสดงความนับถือ</w:t>
       </w:r>
     </w:p>
-    <w:p>
-      <w:pPr>
-        <w:jc w:val="left"/>
-      </w:pPr>
-      <w:r>
-        <w:t>จำนวน 14 แผ่น</w:t>
-      </w:r>
-    </w:p>
-    <w:p>
-      <w:pPr>
-        <w:jc w:val="left"/>
-      </w:pPr>
-    </w:p>
+    <w:p/>
+    <w:p/>
+    <w:p/>
     <w:p>
       <w:pPr>
         <w:jc w:val="center"/>
       </w:pPr>
       <w:r>
-        <w:t>ด้วยคณะกรรมการป้องกันและปราบปรามการทุจริตในภาครัฐ (คณะกรรมการ ป.ป.ท.)</w:t>
-      </w:r>
-    </w:p>
-    <w:p>
-      <w:pPr>
-        <w:jc w:val="left"/>
-      </w:pPr>
-      <w:r>
-        <w:t>ได้ดำเนินการไต่สวน โดยแต่งตั้งคณะพนักงานไต่สวน กรณีกล่าวหา นางมณฑา อยู่นิ่ม ขณะเกิดเหตุ</w:t>
-      </w:r>
-    </w:p>
-    <w:p>
-      <w:pPr>
-        <w:jc w:val="left"/>
-      </w:pPr>
-      <w:r>
-        <w:t>เป็นพนักงานมหาวิทยาลัย ตำแหน่ง นักวิชาการพัสดุชำนาญการ ประเภทเชี่ยวชาญเฉพาะ</w:t>
-      </w:r>
-    </w:p>
-    <w:p>
-      <w:pPr>
-        <w:jc w:val="left"/>
-      </w:pPr>
-      <w:r>
-        <w:t>สังกัด สำนักงานเลขานุการ คณะมนุษยศาสตร์ มหาวิทยาลัยนเรศวร ผู้ถูกกล่าวหาที่ 1 ว่ากระทำความผิด</w:t>
-      </w:r>
-    </w:p>
-    <w:p>
-      <w:pPr>
-        <w:jc w:val="left"/>
-      </w:pPr>
-      <w:r>
-        <w:t>ฐานทุจริตต่อหน้าที่</w:t>
-      </w:r>
-    </w:p>
-    <w:p>
-      <w:pPr>
-        <w:jc w:val="left"/>
-      </w:pPr>
-    </w:p>
-    <w:p>
-      <w:pPr>
-        <w:jc w:val="center"/>
-      </w:pPr>
-      <w:r>
-        <w:t>คณะกรรมการ ป.ป.ท. ได้พิจารณาสำนวนการไต่สวน ในคราวประชุม ครั้งที่ 61/2569</w:t>
-      </w:r>
-    </w:p>
-    <w:p>
-      <w:pPr>
-        <w:jc w:val="left"/>
-      </w:pPr>
-      <w:r>
-        <w:t>เมื่อวันที่ 19 สิงหาคม 2569 แล้วมีมติเป็นเอกฉันท์วินิจฉัยชี้มูลความผิด ดังนี้</w:t>
-      </w:r>
-    </w:p>
-    <w:p>
-      <w:pPr>
-        <w:jc w:val="left"/>
-      </w:pPr>
-    </w:p>
-    <w:p>
-      <w:pPr>
-        <w:jc w:val="left"/>
-      </w:pPr>
-    </w:p>
-    <w:p>
-      <w:pPr>
-        <w:jc w:val="left"/>
-      </w:pPr>
-    </w:p>
-    <w:p>
-      <w:pPr>
-        <w:jc w:val="left"/>
-      </w:pPr>
-      <w:r>
-        <w:t>ความผิดทางอาญา</w:t>
-      </w:r>
-    </w:p>
-    <w:p>
-      <w:pPr>
-        <w:jc w:val="left"/>
-      </w:pPr>
-    </w:p>
-    <w:p>
-      <w:pPr>
-        <w:jc w:val="left"/>
-      </w:pPr>
-      <w:r>
-        <w:t>1.  ฎีกาที่ 100 กรณีเบิกจ่ายเงินจำนวน ๓,6๐๐ บาท</w:t>
-      </w:r>
-    </w:p>
-    <w:p>
-      <w:pPr>
-        <w:jc w:val="left"/>
-      </w:pPr>
-    </w:p>
-    <w:p>
-      <w:pPr>
-        <w:jc w:val="center"/>
-      </w:pPr>
-      <w:r>
-        <w:t xml:space="preserve"> การกระทำของ นางมณฑา อยู่นิ่ม ผู้ถูกกล่าวหาที่ 1 เป็นความผิดตามประมวลกฎหมายอาญา</w:t>
-      </w:r>
-    </w:p>
-    <w:p>
-      <w:pPr>
-        <w:jc w:val="left"/>
-      </w:pPr>
-      <w:r>
-        <w:t>มาตรา 147 มาตรา 157 มาตรา 161 และพระราชบัญญัติประกอบรัฐธรรมนูญว่าด้วยการป้องกัน</w:t>
-      </w:r>
-    </w:p>
-    <w:p>
-      <w:pPr>
-        <w:jc w:val="left"/>
-      </w:pPr>
-      <w:r>
-        <w:t>และปราบปรามการทุจริต พ.ศ. ๒๕๔๒ และที่แก้ไขเพิ่มเติม มาตรา ๑๒๓/๑ ซึ่งเป็นกฎหมายที่ใช้บังคับ</w:t>
-      </w:r>
-    </w:p>
-    <w:p>
-      <w:pPr>
-        <w:jc w:val="left"/>
-      </w:pPr>
-      <w:r>
-        <w:t>ขณะกระทำความผิด (ปัจจุบันเป็นความผิดตามพระราชบัญญัติประกอบรัฐธรรมนูญว่าด้วยการป้องกัน</w:t>
-      </w:r>
-    </w:p>
-    <w:p>
-      <w:pPr>
-        <w:jc w:val="left"/>
-      </w:pPr>
-      <w:r>
-        <w:t>และปราบปรามการทุจริต พ.ศ. 2561 มาตรา 172) ประกอบประมวลกฎหมายอาญา มาตรา 91</w:t>
-      </w:r>
-    </w:p>
-    <w:p>
-      <w:pPr>
-        <w:jc w:val="left"/>
-      </w:pPr>
-    </w:p>
-    <w:p>
-      <w:pPr>
-        <w:jc w:val="center"/>
-      </w:pPr>
-      <w:r>
-        <w:t>2. กรณีการจ่ายเงินจำนวน ๓,๕๐๐ บาท (โดยไม่ได้จัดทำฎีกาในการเบิกจ่าย)</w:t>
-      </w:r>
-    </w:p>
-    <w:p>
-      <w:pPr>
-        <w:jc w:val="left"/>
-      </w:pPr>
-    </w:p>
-    <w:p>
-      <w:pPr>
-        <w:jc w:val="center"/>
-      </w:pPr>
-      <w:r>
-        <w:t xml:space="preserve"> การกระทำของ นางมณฑา อยู่นิ่ม ผู้ถูกกล่าวหาที่ 1 เป็นความผิดตามประมวลกฎหมายอาญา</w:t>
-      </w:r>
-    </w:p>
-    <w:p>
-      <w:pPr>
-        <w:jc w:val="left"/>
-      </w:pPr>
-      <w:r>
-        <w:t>มาตรา 147 มาตรา 157 มาตรา 161 และพระราชบัญญัติประกอบรัฐธรรมนูญว่าด้วยการป้องกัน</w:t>
-      </w:r>
-    </w:p>
-    <w:p>
-      <w:pPr>
-        <w:jc w:val="left"/>
-      </w:pPr>
-      <w:r>
-        <w:t>และปราบปรามการทุจริต พ.ศ. ๒๕๔๒ และที่แก้ไขเพิ่มเติม มาตรา ๑๒๓/๑ ซึ่งเป็นกฎหมายที่ใช้บังคับ</w:t>
-      </w:r>
-    </w:p>
-    <w:p>
-      <w:pPr>
-        <w:jc w:val="left"/>
-      </w:pPr>
-      <w:r>
-        <w:t>ขณะกระทำความผิด (ปัจจุบันเป็นความผิดตามพระราชบัญญัติประกอบรัฐธรรมนูญว่าด้วยการป้องกัน</w:t>
-      </w:r>
-    </w:p>
-    <w:p>
-      <w:pPr>
-        <w:jc w:val="left"/>
-      </w:pPr>
-      <w:r>
-        <w:t>และปราบปรามการทุจริต พ.ศ. 2561 มาตรา 172) ประกอบประมวลกฎหมายอาญา มาตรา 91</w:t>
-      </w:r>
-    </w:p>
-    <w:p>
-      <w:pPr>
-        <w:jc w:val="left"/>
-      </w:pPr>
-      <w:r>
-        <w:t xml:space="preserve"> 3. ฎีกาที่ 171 กรณีเบิกจ่ายเงินจำนวน ๑๐,๐๐๐ บาท</w:t>
-      </w:r>
-    </w:p>
-    <w:p>
-      <w:pPr>
-        <w:jc w:val="left"/>
-      </w:pPr>
-    </w:p>
-    <w:p>
-      <w:pPr>
-        <w:jc w:val="center"/>
-      </w:pPr>
-      <w:r>
-        <w:t xml:space="preserve"> การกระทำของ นางมณฑา อยู่นิ่ม ผู้ถูกกล่าวหาที่ 1 เป็นความผิดตามประมวลกฎหมายอาญา</w:t>
-      </w:r>
-    </w:p>
-    <w:p>
-      <w:pPr>
-        <w:jc w:val="left"/>
-      </w:pPr>
-      <w:r>
-        <w:t>มาตรา 147 มาตรา 157 มาตรา 161 และพระราชบัญญัติประกอบรัฐธรรมนูญว่าด้วยการป้องกัน</w:t>
-      </w:r>
-    </w:p>
-    <w:p>
-      <w:pPr>
-        <w:jc w:val="left"/>
-      </w:pPr>
-      <w:r>
-        <w:t>และปราบปรามการทุจริต พ.ศ. ๒๕๔๒ และที่แก้ไขเพิ่มเติม มาตรา ๑๒๓/๑ ซึ่งเป็นกฎหมายที่ใช้บังคับ</w:t>
-      </w:r>
-    </w:p>
-    <w:p>
-      <w:pPr>
-        <w:jc w:val="left"/>
-      </w:pPr>
-    </w:p>
-    <w:p>
-      <w:pPr>
-        <w:jc w:val="right"/>
-      </w:pPr>
-      <w:r>
-        <w:t>ขณะกระทำความผิด…</w:t>
-      </w:r>
-    </w:p>
-    <w:p>
-      <w:pPr>
-        <w:jc w:val="left"/>
-      </w:pPr>
-    </w:p>
-    <w:p>
-      <w:pPr>
-        <w:jc w:val="center"/>
-      </w:pPr>
-      <w:r>
-        <w:t>- 2 -</w:t>
-      </w:r>
-    </w:p>
-    <w:p>
-      <w:pPr>
-        <w:jc w:val="left"/>
-      </w:pPr>
-      <w:r>
-        <w:t>ขณะกระทำความผิด (ปัจจุบันเป็นความผิดตามพระราชบัญญัติประกอบรัฐธรรมนูญว่าด้วยการป้องกัน</w:t>
-      </w:r>
-    </w:p>
-    <w:p>
-      <w:pPr>
-        <w:jc w:val="left"/>
-      </w:pPr>
-      <w:r>
-        <w:t>และปราบปรามการทุจริต พ.ศ. 2561 มาตรา 172) ประกอบประมวลกฎหมายอาญา มาตรา 91</w:t>
-      </w:r>
-    </w:p>
-    <w:p>
-      <w:pPr>
-        <w:jc w:val="left"/>
-      </w:pPr>
-    </w:p>
-    <w:p>
-      <w:pPr>
-        <w:jc w:val="left"/>
-      </w:pPr>
-      <w:r>
-        <w:t>4. ฎีกาที่ 039 กรณีเบิกจ่ายเงินจำนวน 54,000 บาท</w:t>
-      </w:r>
-    </w:p>
-    <w:p>
-      <w:pPr>
-        <w:jc w:val="left"/>
-      </w:pPr>
-    </w:p>
-    <w:p>
-      <w:pPr>
-        <w:jc w:val="center"/>
-      </w:pPr>
-      <w:r>
-        <w:t xml:space="preserve"> การกระทำของ นางมณฑา อยู่นิ่ม ผู้ถูกกล่าวหาที่ 1 เป็นความผิดตามประมวลกฎหมายอาญา</w:t>
-      </w:r>
-    </w:p>
-    <w:p>
-      <w:pPr>
-        <w:jc w:val="left"/>
-      </w:pPr>
-      <w:r>
-        <w:t>มาตรา 147 มาตรา 157 มาตรา 161 และพระราชบัญญัติประกอบรัฐธรรมนูญว่าด้วยการป้องกัน</w:t>
-      </w:r>
-    </w:p>
-    <w:p>
-      <w:pPr>
-        <w:jc w:val="left"/>
-      </w:pPr>
-      <w:r>
-        <w:t>และปราบปรามการทุจริต พ.ศ. ๒๕๔๒ และที่แก้ไขเพิ่มเติม มาตรา ๑๒๓/๑ ซึ่งเป็นกฎหมายที่ใช้บังคับ</w:t>
-      </w:r>
-    </w:p>
-    <w:p>
-      <w:pPr>
-        <w:jc w:val="left"/>
-      </w:pPr>
-      <w:r>
-        <w:t>ขณะกระทำความผิด (ปัจจุบันเป็นความผิดตามพระราชบัญญัติประกอบรัฐธรรมนูญว่าด้วยการป้องกัน</w:t>
-      </w:r>
-    </w:p>
-    <w:p>
-      <w:pPr>
-        <w:jc w:val="left"/>
-      </w:pPr>
-      <w:r>
-        <w:t>และปราบปรามการทุจริต พ.ศ. 2561 มาตรา 172) ประกอบประมวลกฎหมายอาญา มาตรา 91</w:t>
-      </w:r>
-    </w:p>
-    <w:p>
-      <w:pPr>
-        <w:jc w:val="left"/>
-      </w:pPr>
-    </w:p>
-    <w:p>
-      <w:pPr>
-        <w:jc w:val="center"/>
-      </w:pPr>
-      <w:r>
-        <w:t>5. ฎีกาที่ 145 กรณีเบิกจ่ายเงินจำนวน 8,195 บาท (แต่มียอดหนี้ จำนวน ๑๐,๕๐๐ บาท)</w:t>
-      </w:r>
-    </w:p>
-    <w:p>
-      <w:pPr>
-        <w:jc w:val="left"/>
-      </w:pPr>
-    </w:p>
-    <w:p>
-      <w:pPr>
-        <w:jc w:val="center"/>
-      </w:pPr>
-      <w:r>
-        <w:t xml:space="preserve"> การกระทำของ นางมณฑา อยู่นิ่ม ผู้ถูกกล่าวหาที่ 1 เป็นความผิดตามประมวลกฎหมายอาญา</w:t>
-      </w:r>
-    </w:p>
-    <w:p>
-      <w:pPr>
-        <w:jc w:val="left"/>
-      </w:pPr>
-      <w:r>
-        <w:t>มาตรา 147 มาตรา 157 มาตรา 161 และพระราชบัญญัติประกอบรัฐธรรมนูญว่าด้วยการป้องกัน</w:t>
-      </w:r>
-    </w:p>
-    <w:p>
-      <w:pPr>
-        <w:jc w:val="left"/>
-      </w:pPr>
-      <w:r>
-        <w:t>และปราบปรามการทุจริต พ.ศ. ๒๕๔๒ และที่แก้ไขเพิ่มเติม มาตรา ๑๒๓/๑ ซึ่งเป็นกฎหมายที่ใช้บังคับ</w:t>
-      </w:r>
-    </w:p>
-    <w:p>
-      <w:pPr>
-        <w:jc w:val="left"/>
-      </w:pPr>
-      <w:r>
-        <w:t>ขณะกระทำความผิด (ปัจจุบันเป็นความผิดตามพระราชบัญญัติประกอบรัฐธรรมนูญว่าด้วยการป้องกัน</w:t>
-      </w:r>
-    </w:p>
-    <w:p>
-      <w:pPr>
-        <w:jc w:val="left"/>
-      </w:pPr>
-      <w:r>
-        <w:t>และปราบปรามการทุจริต พ.ศ. 2561 มาตรา 172) ประกอบประมวลกฎหมายอาญา มาตรา 91</w:t>
-      </w:r>
-    </w:p>
-    <w:p>
-      <w:pPr>
-        <w:jc w:val="left"/>
-      </w:pPr>
-    </w:p>
-    <w:p>
-      <w:pPr>
-        <w:jc w:val="left"/>
-      </w:pPr>
-      <w:r>
-        <w:t>6. ฎีกาที่ 041 กรณีเบิกจ่ายเงินจำนวน ๗๓,๓๐๐ บาท</w:t>
-      </w:r>
-    </w:p>
-    <w:p>
-      <w:pPr>
-        <w:jc w:val="left"/>
-      </w:pPr>
-    </w:p>
-    <w:p>
-      <w:pPr>
-        <w:jc w:val="center"/>
-      </w:pPr>
-      <w:r>
-        <w:t xml:space="preserve"> การกระทำของ นางมณฑา อยู่นิ่ม ผู้ถูกกล่าวหาที่ 1 เป็นความผิดตามประมวลกฎหมายอาญา</w:t>
-      </w:r>
-    </w:p>
-    <w:p>
-      <w:pPr>
-        <w:jc w:val="left"/>
-      </w:pPr>
-      <w:r>
-        <w:t>มาตรา 147 มาตรา 157 มาตรา 161 และพระราชบัญญัติประกอบรัฐธรรมนูญว่าด้วยการป้องกัน</w:t>
-      </w:r>
-    </w:p>
-    <w:p>
-      <w:pPr>
-        <w:jc w:val="left"/>
-      </w:pPr>
-      <w:r>
-        <w:t>และปราบปรามการทุจริต พ.ศ. ๒๕๔๒ และที่แก้ไขเพิ่มเติม มาตรา ๑๒๓/๑ ซึ่งเป็นกฎหมายที่ใช้บังคับ</w:t>
-      </w:r>
-    </w:p>
-    <w:p>
-      <w:pPr>
-        <w:jc w:val="left"/>
-      </w:pPr>
-      <w:r>
-        <w:t>ขณะกระทำความผิด (ปัจจุบันเป็นความผิดตามพระราชบัญญัติประกอบรัฐธรรมนูญว่าด้วยการป้องกัน</w:t>
-      </w:r>
-    </w:p>
-    <w:p>
-      <w:pPr>
-        <w:jc w:val="left"/>
-      </w:pPr>
-      <w:r>
-        <w:t>และปราบปรามการทุจริต พ.ศ. 2561 มาตรา 172) ประกอบประมวลกฎหมายอาญา มาตรา 91</w:t>
-      </w:r>
-    </w:p>
-    <w:p>
-      <w:pPr>
-        <w:jc w:val="left"/>
-      </w:pPr>
-    </w:p>
-    <w:p>
-      <w:pPr>
-        <w:jc w:val="left"/>
-      </w:pPr>
-      <w:r>
-        <w:t>7. ฎีกาที่ 304 กรณีเบิกจ่ายเงินจำนวน 8,160 บาท</w:t>
-      </w:r>
-    </w:p>
-    <w:p>
-      <w:pPr>
-        <w:jc w:val="left"/>
-      </w:pPr>
-    </w:p>
-    <w:p>
-      <w:pPr>
-        <w:jc w:val="center"/>
-      </w:pPr>
-      <w:r>
-        <w:t xml:space="preserve"> การกระทำของ นางมณฑา อยู่นิ่ม ผู้ถูกกล่าวหาที่ 1 เป็นความผิดตามประมวลกฎหมายอาญา</w:t>
-      </w:r>
-    </w:p>
-    <w:p>
-      <w:pPr>
-        <w:jc w:val="left"/>
-      </w:pPr>
-      <w:r>
-        <w:t>มาตรา 147 มาตรา 157 มาตรา 161 และพระราชบัญญัติประกอบรัฐธรรมนูญว่าด้วยการป้องกัน</w:t>
-      </w:r>
-    </w:p>
-    <w:p>
-      <w:pPr>
-        <w:jc w:val="left"/>
-      </w:pPr>
-      <w:r>
-        <w:t>และปราบปรามการทุจริต พ.ศ. ๒๕๔๒ และที่แก้ไขเพิ่มเติม มาตรา ๑๒๓/๑ ซึ่งเป็นกฎหมายที่ใช้บังคับ</w:t>
-      </w:r>
-    </w:p>
-    <w:p>
-      <w:pPr>
-        <w:jc w:val="left"/>
-      </w:pPr>
-      <w:r>
-        <w:t>ขณะกระทำความผิด (ปัจจุบันเป็นความผิดตามพระราชบัญญัติประกอบรัฐธรรมนูญว่าด้วยการป้องกัน</w:t>
-      </w:r>
-    </w:p>
-    <w:p>
-      <w:pPr>
-        <w:jc w:val="left"/>
-      </w:pPr>
-      <w:r>
-        <w:t>และปราบปรามการทุจริต พ.ศ. 2561 มาตรา 172) ประกอบประมวลกฎหมายอาญา มาตรา 91</w:t>
+        <w:t>({signatory_name})</w:t>
       </w:r>
     </w:p>
     <w:p>
@@ -659,487 +122,26 @@
         <w:jc w:val="center"/>
       </w:pPr>
       <w:r>
-        <w:t>8. ฎีกาที่ 911 กรณีเบิกจ่ายเงินจำนวน ๖๗,5๐๐ บาท (แต่มียอดหนี้เพียง ๖๔,๕๐๐ บาท)</w:t>
+        <w:t>{signatory_position}</w:t>
+      </w:r>
+    </w:p>
+    <w:p/>
+    <w:p>
+      <w:r>
+        <w:t>สำนักงานป้องกันและปราบปรามการทุจริตในภาครัฐ เขต {pacc_region}</w:t>
       </w:r>
     </w:p>
     <w:p>
-      <w:pPr>
-        <w:jc w:val="left"/>
-      </w:pPr>
-    </w:p>
-    <w:p>
-      <w:pPr>
-        <w:jc w:val="left"/>
-      </w:pPr>
-    </w:p>
-    <w:p>
-      <w:pPr>
-        <w:jc w:val="center"/>
-      </w:pPr>
       <w:r>
-        <w:t xml:space="preserve"> การกระทำของ นางมณฑา อยู่นิ่ม ผู้ถูกกล่าวหาที่ 1 เป็นความผิดตามประมวลกฎหมายอาญา</w:t>
+        <w:t>โทร {contact_phone}</w:t>
       </w:r>
     </w:p>
     <w:p>
-      <w:pPr>
-        <w:jc w:val="left"/>
-      </w:pPr>
       <w:r>
-        <w:t>มาตรา 147 มาตรา 157 มาตรา 161 มาตรา 162 (4) มาตรา 265 มาตรา 268 และพระราชบัญญัติประกอบ</w:t>
+        <w:t>ผู้ประสานงาน / พนักงาน ป.ป.ท. เจ้าของสำนวน {case_officer}</w:t>
       </w:r>
     </w:p>
-    <w:p>
-      <w:pPr>
-        <w:jc w:val="left"/>
-      </w:pPr>
-      <w:r>
-        <w:t>รัฐธรรมนูญว่าด้วยการป้องกันและปราบปรามการทุจริต พ.ศ. ๒๕๔๒ และที่แก้ไขเพิ่มเติม มาตรา ๑๒๓/๑</w:t>
-      </w:r>
-    </w:p>
-    <w:p>
-      <w:pPr>
-        <w:jc w:val="left"/>
-      </w:pPr>
-      <w:r>
-        <w:t>ซึ่งเป็นกฎหมายที่ใช้บังคับขณะกระทำความผิด (ปัจจุบันเป็นความผิดตามพระราชบัญญัติประกอบรัฐธรรมนูญ</w:t>
-      </w:r>
-    </w:p>
-    <w:p>
-      <w:pPr>
-        <w:jc w:val="left"/>
-      </w:pPr>
-      <w:r>
-        <w:t>ว่าด้วยการป้องกันและปราบปรามการทุจริต พ.ศ. 2561 มาตรา 172) ประกอบประมวลกฎหมายอาญา</w:t>
-      </w:r>
-    </w:p>
-    <w:p>
-      <w:pPr>
-        <w:jc w:val="left"/>
-      </w:pPr>
-      <w:r>
-        <w:t>มาตรา 91</w:t>
-      </w:r>
-    </w:p>
-    <w:p>
-      <w:pPr>
-        <w:jc w:val="left"/>
-      </w:pPr>
-    </w:p>
-    <w:p>
-      <w:pPr>
-        <w:jc w:val="center"/>
-      </w:pPr>
-      <w:r>
-        <w:t>9. กรณีการสั่งซื้อวัสดุจาก บริษัท เอส.เค. โอเอ เซ็นเตอร์ จำกัด รวมเป็นเงินจำนวน</w:t>
-      </w:r>
-    </w:p>
-    <w:p>
-      <w:pPr>
-        <w:jc w:val="left"/>
-      </w:pPr>
-      <w:r>
-        <w:t>76,000 บาท แต่ตามฎีกาที่ 229 กลับมีการเบิกจ่ายเงินให้กับร้าน ไอ อี ออฟฟิศ ซัพพลาย เป็นเงินจำนวน</w:t>
-      </w:r>
-    </w:p>
-    <w:p>
-      <w:pPr>
-        <w:jc w:val="left"/>
-      </w:pPr>
-      <w:r>
-        <w:t>50,000 บาท</w:t>
-      </w:r>
-    </w:p>
-    <w:p>
-      <w:pPr>
-        <w:jc w:val="left"/>
-      </w:pPr>
-    </w:p>
-    <w:p>
-      <w:pPr>
-        <w:jc w:val="right"/>
-      </w:pPr>
-      <w:r>
-        <w:t>การกระทำของ...</w:t>
-      </w:r>
-    </w:p>
-    <w:p>
-      <w:pPr>
-        <w:jc w:val="left"/>
-      </w:pPr>
-    </w:p>
-    <w:p>
-      <w:pPr>
-        <w:jc w:val="center"/>
-      </w:pPr>
-      <w:r>
-        <w:t>- 3 -</w:t>
-      </w:r>
-    </w:p>
-    <w:p>
-      <w:pPr>
-        <w:jc w:val="left"/>
-      </w:pPr>
-    </w:p>
-    <w:p>
-      <w:pPr>
-        <w:jc w:val="center"/>
-      </w:pPr>
-      <w:r>
-        <w:t xml:space="preserve"> การกระทำของ นางมณฑา อยู่นิ่ม ผู้ถูกกล่าวหาที่ 1 เป็นความผิดตามประมวลกฎหมายอาญา</w:t>
-      </w:r>
-    </w:p>
-    <w:p>
-      <w:pPr>
-        <w:jc w:val="left"/>
-      </w:pPr>
-      <w:r>
-        <w:t>มาตรา 147 มาตรา 157 มาตรา 161 และพระราชบัญญัติประกอบรัฐธรรมนูญว่าด้วยการป้องกัน</w:t>
-      </w:r>
-    </w:p>
-    <w:p>
-      <w:pPr>
-        <w:jc w:val="left"/>
-      </w:pPr>
-      <w:r>
-        <w:t>และปราบปรามการทุจริต พ.ศ. ๒๕๔๒ และที่แก้ไขเพิ่มเติม มาตรา ๑๒๓/๑ ซึ่งเป็นกฎหมายที่ใช้บังคับ</w:t>
-      </w:r>
-    </w:p>
-    <w:p>
-      <w:pPr>
-        <w:jc w:val="left"/>
-      </w:pPr>
-      <w:r>
-        <w:t>ขณะกระทำความผิด (ปัจจุบันเป็นความผิดตามพระราชบัญญัติประกอบรัฐธรรมนูญว่าด้วยการป้องกัน</w:t>
-      </w:r>
-    </w:p>
-    <w:p>
-      <w:pPr>
-        <w:jc w:val="left"/>
-      </w:pPr>
-      <w:r>
-        <w:t>และปราบปรามการทุจริต พ.ศ. 2561 มาตรา 172) ประกอบประมวลกฎหมายอาญา มาตรา 91</w:t>
-      </w:r>
-    </w:p>
-    <w:p>
-      <w:pPr>
-        <w:jc w:val="left"/>
-      </w:pPr>
-    </w:p>
-    <w:p>
-      <w:pPr>
-        <w:jc w:val="left"/>
-      </w:pPr>
-      <w:r>
-        <w:t xml:space="preserve"> ความผิดทางวินัย</w:t>
-      </w:r>
-    </w:p>
-    <w:p>
-      <w:pPr>
-        <w:jc w:val="left"/>
-      </w:pPr>
-    </w:p>
-    <w:p>
-      <w:pPr>
-        <w:jc w:val="center"/>
-      </w:pPr>
-      <w:r>
-        <w:t>การกระทำของ นางมณฑา อยู่นิ่ม ผู้ถูกกล่าวหาที่ 1 เป็นความผิดวินัยอย่างร้ายแรง</w:t>
-      </w:r>
-    </w:p>
-    <w:p>
-      <w:pPr>
-        <w:jc w:val="left"/>
-      </w:pPr>
-      <w:r>
-        <w:t>ฐานปฏิบัติหรือละเว้นการปฏิบัติหน้าที่ราชการโดยมิชอบ เพื่อให้ตนเองหรือผู้อื่นได้รับประโยชน์ที่มิควรได้</w:t>
-      </w:r>
-    </w:p>
-    <w:p>
-      <w:pPr>
-        <w:jc w:val="left"/>
-      </w:pPr>
-      <w:r>
-        <w:t>เป็นการทุจริตต่อหน้าที่ราชการ ตามข้อบังคับมหาวิทยาลัยนเรศวรว่าด้วยการบริหารงานบุคคลสำหรับพนักงาน</w:t>
-      </w:r>
-    </w:p>
-    <w:p>
-      <w:pPr>
-        <w:jc w:val="left"/>
-      </w:pPr>
-      <w:r>
-        <w:t>ของมหาวิทยาลัย พ.ศ. 2543 และที่แก้ไขเพิ่มเติม ฉบับที่ 2 พ.ศ. 2557 ข้อ 19 ประกอบพระราชบัญญัติ</w:t>
-      </w:r>
-    </w:p>
-    <w:p>
-      <w:pPr>
-        <w:jc w:val="left"/>
-      </w:pPr>
-      <w:r>
-        <w:t>ระเบียบข้าราชการพลเรือนในสถาบันอุดมศึกษาพ.ศ. ๒๕๔๗ และที่แก้ไขเพิ่มเติม มาตรา 39 วรรคสาม</w:t>
-      </w:r>
-    </w:p>
-    <w:p>
-      <w:pPr>
-        <w:jc w:val="left"/>
-      </w:pPr>
-      <w:r>
-        <w:t>ถือเป็นการกระทำการทุจริตในภาครัฐ ตามนัยมาตรา 3 แห่งพระราชบัญญัติมาตรการของฝ่ายบริหารในการป้องกัน</w:t>
-      </w:r>
-    </w:p>
-    <w:p>
-      <w:pPr>
-        <w:jc w:val="left"/>
-      </w:pPr>
-    </w:p>
-    <w:p>
-      <w:pPr>
-        <w:jc w:val="left"/>
-      </w:pPr>
-      <w:r>
-        <w:t>และปราบปรามการทุจริต พ.ศ. 2551 และที่แก้ไขเพิ่มเติม</w:t>
-      </w:r>
-    </w:p>
-    <w:p>
-      <w:pPr>
-        <w:jc w:val="left"/>
-      </w:pPr>
-    </w:p>
-    <w:p>
-      <w:pPr>
-        <w:jc w:val="left"/>
-      </w:pPr>
-    </w:p>
-    <w:p>
-      <w:pPr>
-        <w:jc w:val="left"/>
-      </w:pPr>
-    </w:p>
-    <w:p>
-      <w:pPr>
-        <w:jc w:val="center"/>
-      </w:pPr>
-      <w:r>
-        <w:t>ดังนั้น เพื่อปฏิบัติตามมาตรา ๓๘ และมาตรา 41 แห่งพระราชบัญญัติมาตรการของฝ่ายบริหาร</w:t>
-      </w:r>
-    </w:p>
-    <w:p>
-      <w:pPr>
-        <w:jc w:val="left"/>
-      </w:pPr>
-      <w:r>
-        <w:t>ในการป้องกันและปราบปรามการทุจริต พ.ศ. ๒๕๕๑ และที่แก้ไขเพิ่มเติม จึงขอส่งรายงานการไต่สวน</w:t>
-      </w:r>
-    </w:p>
-    <w:p>
-      <w:pPr>
-        <w:jc w:val="left"/>
-      </w:pPr>
-      <w:r>
-        <w:t>เพื่อวินิจฉัยชี้มูลของคณะกรรมการ ป.ป.ท. และเอกสารที่เกี่ยวข้องมายังท่าน เพื่อพิจารณาโทษทางวินัยแก่</w:t>
-      </w:r>
-    </w:p>
-    <w:p>
-      <w:pPr>
-        <w:jc w:val="left"/>
-      </w:pPr>
-      <w:r>
-        <w:t>นางมณฑา อยู่นิ่ม ผู้ถูกกล่าวหาที่ 1 ในฐานความผิดดังกล่าวตามกฎหมาย ระเบียบ หรือข้อบังคับ</w:t>
-      </w:r>
-    </w:p>
-    <w:p>
-      <w:pPr>
-        <w:jc w:val="left"/>
-      </w:pPr>
-      <w:r>
-        <w:t>ว่าด้วยการบริหารงานบุคคลที่ใช้บังคับกับผู้ถูกกล่าวหา ภายใน 6๐ วัน นับแต่วันที่ได้รับแจ้งมติ</w:t>
-      </w:r>
-    </w:p>
-    <w:p>
-      <w:pPr>
-        <w:jc w:val="left"/>
-      </w:pPr>
-      <w:r>
-        <w:t>คณะกรรมการ ป.ป.ท. โดยมิต้องดำเนินการสอบสวนทางวินัยอีก และเมื่อได้ดำเนินการลงโทษทางวินัยแล้ว</w:t>
-      </w:r>
-    </w:p>
-    <w:p>
-      <w:pPr>
-        <w:jc w:val="left"/>
-      </w:pPr>
-      <w:r>
-        <w:t>ขอได้ส่งสำเนาคำสั่งลงโทษดังกล่าวให้คณะกรรมการ ป.ป.ท. ทราบ ภายใน 30 วัน นับแต่วันที่ได้ออกคำสั่งด้วย</w:t>
-      </w:r>
-    </w:p>
-    <w:p>
-      <w:pPr>
-        <w:jc w:val="center"/>
-      </w:pPr>
-      <w:r>
-        <w:t>อนึ่ง สำหรับความผิดทางอาญาในเรื่องนี้ ได้ส่งเรื่องให้พนักงานอัยการ เพื่อดำเนินคดีอาญา</w:t>
-      </w:r>
-    </w:p>
-    <w:p>
-      <w:pPr>
-        <w:jc w:val="left"/>
-      </w:pPr>
-      <w:r>
-        <w:t>แก่บุคคลดังกล่าวแล้ว</w:t>
-      </w:r>
-    </w:p>
-    <w:p>
-      <w:pPr>
-        <w:jc w:val="left"/>
-      </w:pPr>
-      <w:r>
-        <w:t>จึงเรียนมาเพื่อโปรดพิจารณาดำเนินการในส่วนที่เกี่ยวข้องต่อไป</w:t>
-      </w:r>
-    </w:p>
-    <w:p>
-      <w:pPr>
-        <w:jc w:val="left"/>
-      </w:pPr>
-    </w:p>
-    <w:p>
-      <w:pPr>
-        <w:jc w:val="left"/>
-      </w:pPr>
-      <w:r>
-        <w:t xml:space="preserve">                                                                ขอแสดงความนับถือ</w:t>
-      </w:r>
-    </w:p>
-    <w:p>
-      <w:pPr>
-        <w:jc w:val="left"/>
-      </w:pPr>
-    </w:p>
-    <w:p>
-      <w:pPr>
-        <w:jc w:val="left"/>
-      </w:pPr>
-    </w:p>
-    <w:p>
-      <w:pPr>
-        <w:jc w:val="left"/>
-      </w:pPr>
-    </w:p>
-    <w:p>
-      <w:pPr>
-        <w:jc w:val="left"/>
-      </w:pPr>
-    </w:p>
-    <w:p>
-      <w:pPr>
-        <w:jc w:val="left"/>
-      </w:pPr>
-      <w:r>
-        <w:t xml:space="preserve">                                                               (นายอำนาจ พวงชมภู)</w:t>
-      </w:r>
-    </w:p>
-    <w:p>
-      <w:pPr>
-        <w:jc w:val="left"/>
-      </w:pPr>
-      <w:r>
-        <w:t xml:space="preserve">                                          ประธานกรรมการป้องกันและปราบปรามการทุจริตในภาครัฐ</w:t>
-      </w:r>
-    </w:p>
-    <w:p>
-      <w:pPr>
-        <w:jc w:val="left"/>
-      </w:pPr>
-    </w:p>
-    <w:p>
-      <w:pPr>
-        <w:jc w:val="left"/>
-      </w:pPr>
-      <w:r>
-        <w:t>สำนักงานป้องกันและปราบปรามการทุจริตในภาครัฐ เขต 6</w:t>
-      </w:r>
-    </w:p>
-    <w:p>
-      <w:pPr>
-        <w:jc w:val="left"/>
-      </w:pPr>
-      <w:r>
-        <w:t>ผอ.กบค ตรวจ                       วันที่</w:t>
-      </w:r>
-    </w:p>
-    <w:p>
-      <w:pPr>
-        <w:jc w:val="left"/>
-      </w:pPr>
-      <w:r>
-        <w:t>โทร 0 5530 4117</w:t>
-      </w:r>
-    </w:p>
-    <w:p>
-      <w:pPr>
-        <w:jc w:val="left"/>
-      </w:pPr>
-      <w:r>
-        <w:t>ผอ.กลุ่มงาน ตรวจ                     วันที่</w:t>
-      </w:r>
-    </w:p>
-    <w:p>
-      <w:pPr>
-        <w:jc w:val="left"/>
-      </w:pPr>
-    </w:p>
-    <w:p>
-      <w:pPr>
-        <w:jc w:val="left"/>
-      </w:pPr>
-      <w:r>
-        <w:t>โทรสาร 0 5530 4118</w:t>
-      </w:r>
-    </w:p>
-    <w:p>
-      <w:pPr>
-        <w:jc w:val="left"/>
-      </w:pPr>
-    </w:p>
-    <w:p>
-      <w:pPr>
-        <w:jc w:val="left"/>
-      </w:pPr>
-      <w:r>
-        <w:t>ผู้จัดทำ</w:t>
-      </w:r>
-    </w:p>
-    <w:p>
-      <w:pPr>
-        <w:jc w:val="left"/>
-      </w:pPr>
-      <w:r>
-        <w:t xml:space="preserve"> …………………… วันที่</w:t>
-      </w:r>
-    </w:p>
-    <w:p>
-      <w:pPr>
-        <w:jc w:val="left"/>
-      </w:pPr>
-      <w:r>
-        <w:t>(นางสาวชัญญาพัชญ์ อุปหล้า พนักงาน ป.ป.ท. เจ้าของสำนวน)</w:t>
-      </w:r>
-    </w:p>
-    <w:p>
-      <w:pPr>
-        <w:jc w:val="left"/>
-      </w:pPr>
-    </w:p>
-    <w:p>
-      <w:pPr>
-        <w:jc w:val="center"/>
-      </w:pPr>
-      <w:r>
-        <w:t>“พลังศรัทธา พลังล่าทุจริต”</w:t>
-      </w:r>
-    </w:p>
-    <w:p>
-      <w:pPr>
-        <w:jc w:val="left"/>
-      </w:pPr>
-    </w:p>
+    <w:p/>
     <w:sectPr>
       <w:pgSz w:w="12240" w:h="15840"/>
       <w:pgMar w:top="1440" w:right="1800" w:bottom="1440" w:left="1800" w:header="720" w:footer="720" w:gutter="0"/>

</xml_diff>